<commit_message>
feat(app): cong kiem tra phien ban + man hinh bat buoc cap nhat (admin dieu khien)
- Backend: bang app_release_config_v2 (admin chinh, khong can sua ENV) +
  appReleaseConfig.ts (so sanh version, danh gia gate).
- Public GET /api/client/app-version?platform=&version= tra minVersion/
  latestVersion/forceUpdate/notes/updateUrl/updateRequired/updateAvailable
  (fail-open).
- Admin GET/PUT /api/v2/admin/app-release + tab "Phien ban app" tren dashboard.
- App: checkServerVersionGate() luc mo app (chi native); updateRequired ->
  overlay chan khong bo qua duoc; web khong bi gate. Them i18n App.update.*
  cho vi/en/zh/ko.
- Cap nhat ROADMAP (#3 xong) + regenerate docx huong dan.

Co-Authored-By: Claude Opus 4.8 (1M context) <noreply@anthropic.com>
</commit_message>
<xml_diff>
--- a/docs/HUONG-DAN-CAU-HINH-ADMIN-TSrecord.docx
+++ b/docs/HUONG-DAN-CAU-HINH-ADMIN-TSrecord.docx
@@ -6038,25 +6038,84 @@
         <w:t xml:space="preserve">Khuyến nghị hoàn thiện luồng cập nhật</w:t>
       </w:r>
     </w:p>
-    <w:p>
-      <w:pPr>
-        <w:pStyle w:val="ListParagraph"/>
-        <w:numPr>
-          <w:ilvl w:val="0"/>
-          <w:numId w:val="1"/>
-        </w:numPr>
-        <w:spacing w:after="50"/>
-      </w:pPr>
-      <w:r>
-        <w:rPr>
-          <w:b/>
-          <w:bCs/>
-        </w:rPr>
-        <w:t xml:space="preserve">Thêm endpoint kiểm tra phiên bản, </w:t>
-      </w:r>
-      <w:r>
-        <w:t xml:space="preserve">ví dụ /api/client/app-version trả {minVersion, latestVersion, forceUpdate, url}. App so sánh với phiên bản hiện tại để hiện thông báo "có bản mới" hoặc chặn nếu dưới minVersion.</w:t>
-      </w:r>
+    <w:tbl>
+      <w:tblPr>
+        <w:tblW w:type="pct" w:w="100%"/>
+        <w:tblBorders>
+          <w:top w:val="single" w:color="0C6759" w:sz="4"/>
+          <w:left w:val="single" w:color="0C6759" w:sz="4"/>
+          <w:bottom w:val="single" w:color="0C6759" w:sz="4"/>
+          <w:right w:val="single" w:color="0C6759" w:sz="4"/>
+          <w:insideH w:val="single" w:color="0C6759" w:sz="4"/>
+          <w:insideV w:val="single" w:color="0C6759" w:sz="4"/>
+        </w:tblBorders>
+      </w:tblPr>
+      <w:tblGrid>
+        <w:gridCol w:w="100"/>
+      </w:tblGrid>
+      <w:tr>
+        <w:tc>
+          <w:tcPr>
+            <w:shd w:fill="EAF4F0" w:color="auto" w:val="clear"/>
+            <w:tcMar>
+              <w:top w:type="dxa" w:w="100"/>
+              <w:left w:type="dxa" w:w="140"/>
+              <w:bottom w:type="dxa" w:w="100"/>
+              <w:right w:type="dxa" w:w="140"/>
+            </w:tcMar>
+          </w:tcPr>
+          <w:p>
+            <w:pPr>
+              <w:spacing w:after="60"/>
+            </w:pPr>
+            <w:r>
+              <w:rPr>
+                <w:b/>
+                <w:bCs/>
+                <w:color w:val="0C6759"/>
+              </w:rPr>
+              <w:t xml:space="preserve">✅ ĐÃ TRIỂN KHAI: cổng kiểm tra phiên bản (server-driven)</w:t>
+            </w:r>
+          </w:p>
+          <w:p>
+            <w:pPr>
+              <w:spacing w:after="40"/>
+            </w:pPr>
+            <w:r>
+              <w:t xml:space="preserve">Endpoint công khai GET /api/client/app-version?platform=&amp;version= trả {minVersion, latestVersion, forceUpdate, notes, updateUrl, updateRequired, updateAvailable}.</w:t>
+            </w:r>
+          </w:p>
+          <w:p>
+            <w:pPr>
+              <w:spacing w:after="40"/>
+            </w:pPr>
+            <w:r>
+              <w:t xml:space="preserve">App (native) gọi lúc khởi động: nếu updateRequired -&gt; hiện overlay BẮT BUỘC cập nhật (không bỏ qua được) + nút mở updateUrl. Web không bị chặn.</w:t>
+            </w:r>
+          </w:p>
+          <w:p>
+            <w:pPr>
+              <w:spacing w:after="40"/>
+            </w:pPr>
+            <w:r>
+              <w:t xml:space="preserve">Admin chỉnh tại tab "Phiên bản app" (minVersion / latestVersion / bật forceUpdate / URL Android-iOS / changelog) — lưu vào bảng app_release_config_v2, KHÔNG cần sửa ENV.</w:t>
+            </w:r>
+          </w:p>
+          <w:p>
+            <w:pPr>
+              <w:spacing w:after="40"/>
+            </w:pPr>
+            <w:r>
+              <w:t xml:space="preserve">Chỉ bật forceUpdate khi bản mới đã có trên store/URL.</w:t>
+            </w:r>
+          </w:p>
+        </w:tc>
+      </w:tr>
+    </w:tbl>
+    <w:p>
+      <w:pPr>
+        <w:spacing w:after="120"/>
+      </w:pPr>
     </w:p>
     <w:p>
       <w:pPr>
@@ -6368,7 +6427,7 @@
                 <w:sz w:val="19"/>
                 <w:szCs w:val="19"/>
               </w:rPr>
-              <w:t xml:space="preserve">Cao</w:t>
+              <w:t xml:space="preserve">✅ Xong</w:t>
             </w:r>
           </w:p>
         </w:tc>
@@ -6391,7 +6450,7 @@
                 <w:sz w:val="19"/>
                 <w:szCs w:val="19"/>
               </w:rPr>
-              <w:t xml:space="preserve">Endpoint version-check + màn hình cập nhật app</w:t>
+              <w:t xml:space="preserve">Endpoint version-check + màn hình bắt buộc cập nhật</w:t>
             </w:r>
           </w:p>
         </w:tc>
@@ -6414,7 +6473,7 @@
                 <w:sz w:val="19"/>
                 <w:szCs w:val="19"/>
               </w:rPr>
-              <w:t xml:space="preserve">Kiểm soát phiên bản, vá lỗi gấp</w:t>
+              <w:t xml:space="preserve">Kiểm soát phiên bản (đã triển khai)</w:t>
             </w:r>
           </w:p>
         </w:tc>

</xml_diff>